<commit_message>
Regenerate proposal with Narrative Arc section populated
Regenerated with the fixed protocol generator (zero-padded scene-heading
match): Section 6 NARRATIVE ARC now lists all seven scenes from
scenes/all_scenes.md instead of being empty.

Co-Authored-By: Claude Fable 5 <noreply@anthropic.com>
Claude-Session: https://claude.ai/code/session_01H23p12afzHFsaMRCoTyY1R
</commit_message>
<xml_diff>
--- a/film/venda_nga_december/proposal.docx
+++ b/film/venda_nga_december/proposal.docx
@@ -1377,6 +1377,236 @@
     <w:p>
       <w:pPr>
         <w:spacing w:before="0" w:after="80"/>
+      </w:pPr>
+    </w:p>
+    <w:p>
+      <w:pPr>
+        <w:spacing w:before="200" w:after="80"/>
+      </w:pPr>
+      <w:r>
+        <w:rPr>
+          <w:rFonts w:ascii="Arial" w:hAnsi="Arial"/>
+          <w:b/>
+          <w:i w:val="0"/>
+          <w:color w:val="1A1A1A"/>
+          <w:sz w:val="20"/>
+        </w:rPr>
+        <w:t>Opening: The Chest  —  0:00 – 2:00</w:t>
+      </w:r>
+    </w:p>
+    <w:p>
+      <w:pPr>
+        <w:spacing w:before="0" w:after="120"/>
+      </w:pPr>
+      <w:r>
+        <w:rPr>
+          <w:rFonts w:ascii="Arial" w:hAnsi="Arial"/>
+          <w:b w:val="0"/>
+          <w:i w:val="0"/>
+          <w:color w:val="1A1A1A"/>
+          <w:sz w:val="20"/>
+        </w:rPr>
+        <w:t>Black screen. A chest. Close. The tattoo fills the frame. VENDA NGA DECEMBER.</w:t>
+      </w:r>
+    </w:p>
+    <w:p>
+      <w:pPr>
+        <w:spacing w:before="0" w:after="100"/>
+      </w:pPr>
+    </w:p>
+    <w:p>
+      <w:pPr>
+        <w:spacing w:before="200" w:after="80"/>
+      </w:pPr>
+      <w:r>
+        <w:rPr>
+          <w:rFonts w:ascii="Arial" w:hAnsi="Arial"/>
+          <w:b/>
+          <w:i w:val="0"/>
+          <w:color w:val="1A1A1A"/>
+          <w:sz w:val="20"/>
+        </w:rPr>
+        <w:t>Act One: Thohoyandou Made Me  —  2:00 – 7:00</w:t>
+      </w:r>
+    </w:p>
+    <w:p>
+      <w:pPr>
+        <w:spacing w:before="0" w:after="120"/>
+      </w:pPr>
+      <w:r>
+        <w:rPr>
+          <w:rFonts w:ascii="Arial" w:hAnsi="Arial"/>
+          <w:b w:val="0"/>
+          <w:i w:val="0"/>
+          <w:color w:val="1A1A1A"/>
+          <w:sz w:val="20"/>
+        </w:rPr>
+        <w:t>Mizo Phyll in the dark room for the first time. Full face. Full light. Unhurried. He speaks about where he came from. Not as nostalgia — as foundation. What Thohoyandou is. What VenRap is and where it grew from. What it meant to be a young man from the north with a sound that had no genre name yet.</w:t>
+      </w:r>
+    </w:p>
+    <w:p>
+      <w:pPr>
+        <w:spacing w:before="0" w:after="100"/>
+      </w:pPr>
+    </w:p>
+    <w:p>
+      <w:pPr>
+        <w:spacing w:before="200" w:after="80"/>
+      </w:pPr>
+      <w:r>
+        <w:rPr>
+          <w:rFonts w:ascii="Arial" w:hAnsi="Arial"/>
+          <w:b/>
+          <w:i w:val="0"/>
+          <w:color w:val="1A1A1A"/>
+          <w:sz w:val="20"/>
+        </w:rPr>
+        <w:t>The Witnesses  —  Woven through Act One and Act Two — not a standalone scene</w:t>
+      </w:r>
+    </w:p>
+    <w:p>
+      <w:pPr>
+        <w:spacing w:before="0" w:after="100"/>
+      </w:pPr>
+    </w:p>
+    <w:p>
+      <w:pPr>
+        <w:spacing w:before="200" w:after="80"/>
+      </w:pPr>
+      <w:r>
+        <w:rPr>
+          <w:rFonts w:ascii="Arial" w:hAnsi="Arial"/>
+          <w:b/>
+          <w:i w:val="0"/>
+          <w:color w:val="1A1A1A"/>
+          <w:sz w:val="20"/>
+        </w:rPr>
+        <w:t>Act Two: The Faith and The Dreads  —  7:00 – 13:00</w:t>
+      </w:r>
+    </w:p>
+    <w:p>
+      <w:pPr>
+        <w:spacing w:before="0" w:after="120"/>
+      </w:pPr>
+      <w:r>
+        <w:rPr>
+          <w:rFonts w:ascii="Arial" w:hAnsi="Arial"/>
+          <w:b w:val="0"/>
+          <w:i w:val="0"/>
+          <w:color w:val="1A1A1A"/>
+          <w:sz w:val="20"/>
+        </w:rPr>
+        <w:t>Mizo speaks about the Rastafari faith. What it meant. What it demanded. What the dreads represented — his words, not anyone's label. Then — the record company. The condition. The dreads that came off.</w:t>
+      </w:r>
+    </w:p>
+    <w:p>
+      <w:pPr>
+        <w:spacing w:before="0" w:after="100"/>
+      </w:pPr>
+    </w:p>
+    <w:p>
+      <w:pPr>
+        <w:spacing w:before="200" w:after="80"/>
+      </w:pPr>
+      <w:r>
+        <w:rPr>
+          <w:rFonts w:ascii="Arial" w:hAnsi="Arial"/>
+          <w:b/>
+          <w:i w:val="0"/>
+          <w:color w:val="1A1A1A"/>
+          <w:sz w:val="20"/>
+        </w:rPr>
+        <w:t>Ricky Rick  —  13:00 – 15:00</w:t>
+      </w:r>
+    </w:p>
+    <w:p>
+      <w:pPr>
+        <w:spacing w:before="0" w:after="120"/>
+      </w:pPr>
+      <w:r>
+        <w:rPr>
+          <w:rFonts w:ascii="Arial" w:hAnsi="Arial"/>
+          <w:b w:val="0"/>
+          <w:i w:val="0"/>
+          <w:color w:val="1A1A1A"/>
+          <w:sz w:val="20"/>
+        </w:rPr>
+        <w:t>Mizo speaks about Ricky Rick. Not the collaboration first — the person. What he was like. What that relationship gave him. What is different now that he is gone. One photograph appears behind him in the dark room. Not cutting away — floating in the frame the way a memory surfaces.</w:t>
+      </w:r>
+    </w:p>
+    <w:p>
+      <w:pPr>
+        <w:spacing w:before="0" w:after="100"/>
+      </w:pPr>
+    </w:p>
+    <w:p>
+      <w:pPr>
+        <w:spacing w:before="200" w:after="80"/>
+      </w:pPr>
+      <w:r>
+        <w:rPr>
+          <w:rFonts w:ascii="Arial" w:hAnsi="Arial"/>
+          <w:b/>
+          <w:i w:val="0"/>
+          <w:color w:val="1A1A1A"/>
+          <w:sz w:val="20"/>
+        </w:rPr>
+        <w:t>Act Three and Four: Venda Nga December  —  15:00 – 21:00</w:t>
+      </w:r>
+    </w:p>
+    <w:p>
+      <w:pPr>
+        <w:spacing w:before="0" w:after="120"/>
+      </w:pPr>
+      <w:r>
+        <w:rPr>
+          <w:rFonts w:ascii="Arial" w:hAnsi="Arial"/>
+          <w:b w:val="0"/>
+          <w:i w:val="0"/>
+          <w:color w:val="1A1A1A"/>
+          <w:sz w:val="20"/>
+        </w:rPr>
+        <w:t>Act Three — The National Stage (15:00–18:00) Mizo speaks about what the music career became. The stages. The recognition. The VenRap platform he built so others from Venda could follow.</w:t>
+      </w:r>
+    </w:p>
+    <w:p>
+      <w:pPr>
+        <w:spacing w:before="0" w:after="100"/>
+      </w:pPr>
+    </w:p>
+    <w:p>
+      <w:pPr>
+        <w:spacing w:before="200" w:after="80"/>
+      </w:pPr>
+      <w:r>
+        <w:rPr>
+          <w:rFonts w:ascii="Arial" w:hAnsi="Arial"/>
+          <w:b/>
+          <w:i w:val="0"/>
+          <w:color w:val="1A1A1A"/>
+          <w:sz w:val="20"/>
+        </w:rPr>
+        <w:t>The Closing Performance  —  21:00 – 23:00</w:t>
+      </w:r>
+    </w:p>
+    <w:p>
+      <w:pPr>
+        <w:spacing w:before="0" w:after="120"/>
+      </w:pPr>
+      <w:r>
+        <w:rPr>
+          <w:rFonts w:ascii="Arial" w:hAnsi="Arial"/>
+          <w:b w:val="0"/>
+          <w:i w:val="0"/>
+          <w:color w:val="1A1A1A"/>
+          <w:sz w:val="20"/>
+        </w:rPr>
+        <w:t>All testimony is complete. The dark room falls quiet. He stands. The coat goes on. The cameras that have watched him speak now watch him perform.</w:t>
+      </w:r>
+    </w:p>
+    <w:p>
+      <w:pPr>
+        <w:spacing w:before="0" w:after="100"/>
       </w:pPr>
     </w:p>
     <w:p>

</xml_diff>